<commit_message>
KB + funnel: unblock review ask (GBP + Trustpilot), pause ambassador ask
- KB Section 3: add Customer Testimonial Form, Google review (GBP), and
  Trustpilot review links.
- Referral & Reviews agent block: review ask unblocked (both review links
  live); add a no-review-gating rule; add an Ambassador ask paused note
  (hold until the program is finalized, perks confirmed, FTC disclosure in
  place, documented in the KB).
- Ownership Map (.md + .docx): review-ask row now live with both links and
  the no-gating rule; add a paused Ambassador ask row.

Co-Authored-By: Claude Opus 4.8 <noreply@anthropic.com>
</commit_message>
<xml_diff>
--- a/Enyrgy_Funnel_Ownership_Map.docx
+++ b/Enyrgy_Funnel_Ownership_Map.docx
@@ -1133,18 +1133,18 @@
                 <w:b/>
                 <w:bCs/>
               </w:rPr>
-              <w:t xml:space="preserve">BLOCKED</w:t>
-            </w:r>
-          </w:p>
-        </w:tc>
-        <w:tc>
-          <w:tcPr/>
-          <w:p>
-            <w:pPr>
-              <w:pStyle w:val="Compact"/>
-            </w:pPr>
-            <w:r>
-              <w:t xml:space="preserve">Do NOT send until the Google Business Profile review link is live in the KB. Both engines must hold it.</w:t>
+              <w:t xml:space="preserve">GHL</w:t>
+            </w:r>
+          </w:p>
+        </w:tc>
+        <w:tc>
+          <w:tcPr/>
+          <w:p>
+            <w:pPr>
+              <w:pStyle w:val="Compact"/>
+            </w:pPr>
+            <w:r>
+              <w:t xml:space="preserve">Review links live: GBP + Trustpilot (KB Section 3). Invite every customer neutrally, no review-gating (FTC/Google/Trustpilot).</w:t>
             </w:r>
           </w:p>
         </w:tc>
@@ -1199,6 +1199,56 @@
             <w:pPr>
               <w:pStyle w:val="Compact"/>
             </w:pPr>
+          </w:p>
+        </w:tc>
+      </w:tr>
+      <w:tr>
+        <w:tc>
+          <w:tcPr/>
+          <w:p>
+            <w:pPr>
+              <w:pStyle w:val="Compact"/>
+            </w:pPr>
+            <w:r>
+              <w:t xml:space="preserve">Ambassador ask</w:t>
+            </w:r>
+          </w:p>
+        </w:tc>
+        <w:tc>
+          <w:tcPr/>
+          <w:p>
+            <w:pPr>
+              <w:pStyle w:val="Compact"/>
+            </w:pPr>
+            <w:r>
+              <w:t xml:space="preserve">customer milestone</w:t>
+            </w:r>
+          </w:p>
+        </w:tc>
+        <w:tc>
+          <w:tcPr/>
+          <w:p>
+            <w:pPr>
+              <w:pStyle w:val="Compact"/>
+            </w:pPr>
+            <w:r>
+              <w:rPr>
+                <w:b/>
+                <w:bCs/>
+              </w:rPr>
+              <w:t xml:space="preserve">PAUSED</w:t>
+            </w:r>
+          </w:p>
+        </w:tc>
+        <w:tc>
+          <w:tcPr/>
+          <w:p>
+            <w:pPr>
+              <w:pStyle w:val="Compact"/>
+            </w:pPr>
+            <w:r>
+              <w:t xml:space="preserve">Do not send until the ambassador program is finalized (perks confirmed, FTC disclosure requirement in place, documented in the KB).</w:t>
+            </w:r>
           </w:p>
         </w:tc>
       </w:tr>

</xml_diff>